<commit_message>
Update PI designation to Interdisciplinary Centre for Quantum Computing and Department of Physics
</commit_message>
<xml_diff>
--- a/Official_Advertisement_PA-I_ANRF.docx
+++ b/Official_Advertisement_PA-I_ANRF.docx
@@ -268,13 +268,9 @@
           </w:tcPr>
           <w:p>
             <w:r>
-              <w:rPr>
-                <w:rFonts w:ascii="Arial" w:hAnsi="Arial"/>
-                <w:sz w:val="19"/>
-              </w:rPr>
               <w:t>Dr. Shashank Gupta</w:t>
               <w:br/>
-              <w:t>Assistant Professor, Department of Physics</w:t>
+              <w:t>Assistant Professor, Interdisciplinary Centre for Quantum Computing and Department of Physics</w:t>
               <w:br/>
               <w:t>Indian Institute of Technology Indore</w:t>
               <w:br/>

</xml_diff>